<commit_message>
Docs: bake a visible Contents page into each doc (was an empty Word TOC field); fix STATUS.md references
</commit_message>
<xml_diff>
--- a/docs/01_Explanation_Document.docx
+++ b/docs/01_Explanation_Document.docx
@@ -80,25 +80,111 @@
         <w:t xml:space="preserve">Contents</w:t>
       </w:r>
     </w:p>
-    <w:sdt>
-      <w:sdtPr>
-        <w:alias w:val="Contents"/>
-      </w:sdtPr>
-      <w:sdtContent>
-        <w:p>
-          <w:r>
-            <w:fldChar w:fldCharType="begin" w:dirty="true"/>
-            <w:instrText xml:space="preserve">TOC \h \o "1-3"</w:instrText>
-            <w:fldChar w:fldCharType="separate"/>
-          </w:r>
-        </w:p>
-        <w:p>
-          <w:r>
-            <w:fldChar w:fldCharType="end"/>
-          </w:r>
-        </w:p>
-      </w:sdtContent>
-    </w:sdt>
+    <w:p>
+      <w:pPr>
+        <w:spacing w:after="36"/>
+      </w:pPr>
+      <w:r>
+        <w:rPr>
+          <w:b/>
+          <w:bCs/>
+          <w:color w:val="1F3864"/>
+          <w:sz w:val="22"/>
+          <w:szCs w:val="22"/>
+        </w:rPr>
+        <w:t xml:space="preserve">1. Purpose</w:t>
+      </w:r>
+    </w:p>
+    <w:p>
+      <w:pPr>
+        <w:spacing w:after="36"/>
+      </w:pPr>
+      <w:r>
+        <w:rPr>
+          <w:b/>
+          <w:bCs/>
+          <w:color w:val="1F3864"/>
+          <w:sz w:val="22"/>
+          <w:szCs w:val="22"/>
+        </w:rPr>
+        <w:t xml:space="preserve">2. The problem it solves</w:t>
+      </w:r>
+    </w:p>
+    <w:p>
+      <w:pPr>
+        <w:spacing w:after="36"/>
+      </w:pPr>
+      <w:r>
+        <w:rPr>
+          <w:b/>
+          <w:bCs/>
+          <w:color w:val="1F3864"/>
+          <w:sz w:val="22"/>
+          <w:szCs w:val="22"/>
+        </w:rPr>
+        <w:t xml:space="preserve">3. How it works, conceptually</w:t>
+      </w:r>
+    </w:p>
+    <w:p>
+      <w:pPr>
+        <w:spacing w:after="36"/>
+      </w:pPr>
+      <w:r>
+        <w:rPr>
+          <w:b/>
+          <w:bCs/>
+          <w:color w:val="1F3864"/>
+          <w:sz w:val="22"/>
+          <w:szCs w:val="22"/>
+        </w:rPr>
+        <w:t xml:space="preserve">4. Key concepts</w:t>
+      </w:r>
+    </w:p>
+    <w:p>
+      <w:pPr>
+        <w:spacing w:after="36"/>
+      </w:pPr>
+      <w:r>
+        <w:rPr>
+          <w:b/>
+          <w:bCs/>
+          <w:color w:val="1F3864"/>
+          <w:sz w:val="22"/>
+          <w:szCs w:val="22"/>
+        </w:rPr>
+        <w:t xml:space="preserve">5. What a run produces</w:t>
+      </w:r>
+    </w:p>
+    <w:p>
+      <w:pPr>
+        <w:spacing w:after="36"/>
+      </w:pPr>
+      <w:r>
+        <w:rPr>
+          <w:b/>
+          <w:bCs/>
+          <w:color w:val="1F3864"/>
+          <w:sz w:val="22"/>
+          <w:szCs w:val="22"/>
+        </w:rPr>
+        <w:t xml:space="preserve">6. The three status columns</w:t>
+      </w:r>
+    </w:p>
+    <w:p>
+      <w:pPr>
+        <w:spacing w:after="36"/>
+      </w:pPr>
+      <w:r>
+        <w:rPr>
+          <w:b/>
+          <w:bCs/>
+          <w:color w:val="1F3864"/>
+          <w:sz w:val="22"/>
+          <w:szCs w:val="22"/>
+        </w:rPr>
+        <w:t xml:space="preserve">7. Where it runs</w:t>
+      </w:r>
+    </w:p>
     <w:p>
       <w:r>
         <w:br w:type="page"/>

</xml_diff>